<commit_message>
SC rising-cost-of-living: independent fact-check (2026-09-04) — every headline claim re-verified against live scstatehouse.gov sources: 31 bills (all act numbers + all cited roll calls, House Yeas and Senate Ayes), 17 committee-stop/conference claims, 9 provisos on the enacted Part IB pages, 9 SC Code sections, H4216 5.21%/1.99% ratified text, H5794 filed 8/11/26; no discrepancies. Report added to working/, summarized in review-report and Appendix I. Scope re-confirmed: rising-cost-of-living files only
Co-authored-by: CaptainWrechols <CaptainWrechols@users.noreply.github.com>
</commit_message>
<xml_diff>
--- a/briefs/south-carolina/rising-cost-of-living/citizen-v2/appendices/appendices.docx
+++ b/briefs/south-carolina/rising-cost-of-living/citizen-v2/appendices/appendices.docx
@@ -62347,6 +62347,82 @@
       </w:r>
       <w:r>
         <w:t xml:space="preserve">anywhere. No party labels appear anywhere (no roster join fetched).</w:t>
+      </w:r>
+    </w:p>
+    <w:p>
+      <w:pPr>
+        <w:numPr>
+          <w:ilvl w:val="0"/>
+          <w:numId w:val="1020"/>
+        </w:numPr>
+        <w:pStyle w:val="Compact"/>
+      </w:pPr>
+      <w:r>
+        <w:t xml:space="preserve">Independent fact-check (2026-09-04): every headline claim was re-verified</w:t>
+      </w:r>
+      <w:r>
+        <w:t xml:space="preserve"> </w:t>
+      </w:r>
+      <w:r>
+        <w:t xml:space="preserve">against sources independent of this repository’s mirror — the live</w:t>
+      </w:r>
+      <w:r>
+        <w:t xml:space="preserve"> </w:t>
+      </w:r>
+      <w:r>
+        <w:t xml:space="preserve">scstatehouse.gov bill histories and ratified texts (31 bills: all act</w:t>
+      </w:r>
+      <w:r>
+        <w:t xml:space="preserve"> </w:t>
+      </w:r>
+      <w:r>
+        <w:t xml:space="preserve">numbers and all cited roll calls matched), the live enacted Part IB pages</w:t>
+      </w:r>
+      <w:r>
+        <w:t xml:space="preserve"> </w:t>
+      </w:r>
+      <w:r>
+        <w:t xml:space="preserve">(9 provisos), and the current SC Code (9 sections), plus the State</w:t>
+      </w:r>
+      <w:r>
+        <w:t xml:space="preserve"> </w:t>
+      </w:r>
+      <w:r>
+        <w:t xml:space="preserve">Register for the graduation regulation.</w:t>
+      </w:r>
+      <w:r>
+        <w:t xml:space="preserve"> </w:t>
+      </w:r>
+      <w:r>
+        <w:rPr>
+          <w:bCs/>
+          <w:b/>
+        </w:rPr>
+        <w:t xml:space="preserve">No discrepancies found.</w:t>
+      </w:r>
+      <w:r>
+        <w:t xml:space="preserve"> </w:t>
+      </w:r>
+      <w:r>
+        <w:t xml:space="preserve">Full</w:t>
+      </w:r>
+      <w:r>
+        <w:t xml:space="preserve"> </w:t>
+      </w:r>
+      <w:r>
+        <w:t xml:space="preserve">report:</w:t>
+      </w:r>
+      <w:r>
+        <w:t xml:space="preserve"> </w:t>
+      </w:r>
+      <w:r>
+        <w:rPr>
+          <w:rStyle w:val="VerbatimChar"/>
+        </w:rPr>
+        <w:t xml:space="preserve">working/south-carolina/rising-cost-of-living/   independent-fact-check-2026-09-04.md</w:t>
+      </w:r>
+      <w:r>
+        <w:t xml:space="preserve">.</w:t>
       </w:r>
     </w:p>
     <w:p>

</xml_diff>